<commit_message>
Adicao de novos UCs
</commit_message>
<xml_diff>
--- a/documentação/Requisitos/RequisitoIncluaNovoUsuario.docx
+++ b/documentação/Requisitos/RequisitoIncluaNovoUsuario.docx
@@ -1593,22 +1593,7 @@
     <w:p/>
     <w:p>
       <w:r>
-        <w:t xml:space="preserve">Crie um caso de uso para a listagem de </w:t>
-      </w:r>
-      <w:r>
-        <w:t>recebimentos</w:t>
-      </w:r>
-      <w:r>
-        <w:t xml:space="preserve">, este caso de uso inicia-se quando um usuário do tipo paciente seleciona no menu a opção </w:t>
-      </w:r>
-      <w:r>
-        <w:t>recebimentos</w:t>
-      </w:r>
-      <w:r>
-        <w:t xml:space="preserve"> o sistema então exibe </w:t>
-      </w:r>
-      <w:r>
-        <w:t>um formulário com os campos Clinica Vinculada, Data de Inicio, Data final, Especialista(que é o especialista logado), Número de Consultas</w:t>
+        <w:t>Crie um caso de uso para a listagem de recebimentos, este caso de uso inicia-se quando um usuário do tipo paciente seleciona no menu a opção recebimentos o sistema então exibe um formulário com os campos Clinica Vinculada, Data de Inicio, Data final, Especialista(que é o especialista logado), Número de Consultas</w:t>
       </w:r>
       <w:r>
         <w:t xml:space="preserve"> que o numero de consultas no </w:t>
@@ -1619,25 +1604,7 @@
       </w:r>
       <w:proofErr w:type="spellEnd"/>
       <w:r>
-        <w:t xml:space="preserve">, Total no Pix que é a soma de todas as consultas no período paga em Pix, Total em dinheiro  </w:t>
-      </w:r>
-      <w:r>
-        <w:t xml:space="preserve">que é a soma de todas as consultas no período paga em </w:t>
-      </w:r>
-      <w:r>
-        <w:t xml:space="preserve">dinheiro, total cartão inclua que é </w:t>
-      </w:r>
-      <w:r>
-        <w:t xml:space="preserve">que é a soma de todas as consultas no período paga </w:t>
-      </w:r>
-      <w:r>
-        <w:t xml:space="preserve">no próprio sistema, total maquineta que </w:t>
-      </w:r>
-      <w:r>
-        <w:t xml:space="preserve">as consultas no período paga </w:t>
-      </w:r>
-      <w:r>
-        <w:t xml:space="preserve">na maquineta do próprio especialista, Comissão da clinica que é uma porcentagem configurada no cadastro da clinica, Comissão Inclua que é uma porcentagem configurada no sistema, e o Saldo que é calculado da seguinte forma: </w:t>
+        <w:t xml:space="preserve">, Total no Pix que é a soma de todas as consultas no período paga em Pix, Total em dinheiro  que é a soma de todas as consultas no período paga em dinheiro, total cartão inclua que é que é a soma de todas as consultas no período paga no próprio sistema, total maquineta que as consultas no período paga na maquineta do próprio especialista, Comissão da clinica que é uma porcentagem configurada no cadastro da clinica, Comissão Inclua que é uma porcentagem configurada no sistema, e o Saldo que é calculado da seguinte forma: </w:t>
       </w:r>
       <w:r>
         <w:t xml:space="preserve">  </w:t>
@@ -2233,6 +2200,86 @@
       </w:r>
     </w:p>
     <w:p/>
+    <w:p>
+      <w:r>
+        <w:t xml:space="preserve">Crie um caso de uso para a </w:t>
+      </w:r>
+      <w:r>
+        <w:t xml:space="preserve">disponibilização de consultas </w:t>
+      </w:r>
+      <w:r>
+        <w:t xml:space="preserve">, este caso de uso inicia-se quando um usuário do tipo </w:t>
+      </w:r>
+      <w:r>
+        <w:t>especialista</w:t>
+      </w:r>
+      <w:r>
+        <w:t xml:space="preserve"> seleciona no menu a opção </w:t>
+      </w:r>
+      <w:r>
+        <w:t xml:space="preserve">disponibilizar consultas, </w:t>
+      </w:r>
+      <w:r>
+        <w:t xml:space="preserve"> o sistema então exibe um formulário com os campos Clinica Vinculada, Data de Inicio, Data </w:t>
+      </w:r>
+      <w:r>
+        <w:t>fim</w:t>
+      </w:r>
+      <w:r>
+        <w:t xml:space="preserve">, </w:t>
+      </w:r>
+      <w:r>
+        <w:t xml:space="preserve">duração média em minutos, intervalo de consultas em minutos, </w:t>
+      </w:r>
+      <w:r>
+        <w:t>Horário do Início dos atendimentos</w:t>
+      </w:r>
+      <w:r>
+        <w:t>,</w:t>
+      </w:r>
+      <w:r>
+        <w:t xml:space="preserve"> </w:t>
+      </w:r>
+      <w:r>
+        <w:t>Horário do Fim dos atendimentos</w:t>
+      </w:r>
+      <w:r>
+        <w:t xml:space="preserve">, </w:t>
+      </w:r>
+      <w:r>
+        <w:t>Preço em R$</w:t>
+      </w:r>
+      <w:r>
+        <w:t xml:space="preserve">, e os dias da semana de segunda a domingo </w:t>
+      </w:r>
+      <w:proofErr w:type="spellStart"/>
+      <w:r>
+        <w:t>multipa</w:t>
+      </w:r>
+      <w:proofErr w:type="spellEnd"/>
+      <w:r>
+        <w:t xml:space="preserve"> escolha, o usuário então preenche os campos e solicita a opção Salvar, o sistema então irá gerar consultas no período solicitado nos dias solicitados com duração solicitada e com intervalo entre as consultas configurada, a opôs a geração o sistema irá pra o UC AGENDA. </w:t>
+      </w:r>
+    </w:p>
+    <w:p>
+      <w:r>
+        <w:lastRenderedPageBreak/>
+        <w:t xml:space="preserve">O sistema também exibe a opção voltar </w:t>
+      </w:r>
+      <w:proofErr w:type="gramStart"/>
+      <w:r>
+        <w:t>onde</w:t>
+      </w:r>
+      <w:proofErr w:type="gramEnd"/>
+      <w:r>
+        <w:t xml:space="preserve"> o Caso de uso retorna para a Agenda.</w:t>
+      </w:r>
+    </w:p>
+    <w:p>
+      <w:r>
+        <w:t xml:space="preserve">Regra de negócio 1: não pode haver duplicidade de consulta no mesmo dia, e na mesma hora. </w:t>
+      </w:r>
+    </w:p>
     <w:p/>
     <w:p>
       <w:r>
@@ -2863,7 +2910,6 @@
   <w:style w:type="character" w:default="1" w:styleId="Fontepargpadro">
     <w:name w:val="Default Paragraph Font"/>
     <w:uiPriority w:val="1"/>
-    <w:semiHidden/>
     <w:unhideWhenUsed/>
   </w:style>
   <w:style w:type="table" w:default="1" w:styleId="Tabelanormal">

</xml_diff>

<commit_message>
SUBINDO UC DE AGENDA CLINICA
</commit_message>
<xml_diff>
--- a/documentação/Requisitos/RequisitoIncluaNovoUsuario.docx
+++ b/documentação/Requisitos/RequisitoIncluaNovoUsuario.docx
@@ -2253,16 +2253,7 @@
     <w:p/>
     <w:p>
       <w:r>
-        <w:t>Crie um caso de uso para a</w:t>
-      </w:r>
-      <w:r>
-        <w:t>s</w:t>
-      </w:r>
-      <w:r>
-        <w:t xml:space="preserve"> consultas , este caso de uso inicia-se quando um usuário do tipo especialista seleciona no menu a opção</w:t>
-      </w:r>
-      <w:r>
-        <w:t xml:space="preserve"> Consultas então o sistema exibe a lista de consultas marcadas pra ele, onde ele pode filtrar essas consultas por </w:t>
+        <w:t xml:space="preserve">Crie um caso de uso para as consultas , este caso de uso inicia-se quando um usuário do tipo especialista seleciona no menu a opção Consultas então o sistema exibe a lista de consultas marcadas pra ele, onde ele pode filtrar essas consultas por </w:t>
       </w:r>
       <w:r>
         <w:t>Data início</w:t>
@@ -2879,6 +2870,185 @@
         <w:t xml:space="preserve"> com operação realizada com sucesso.</w:t>
       </w:r>
     </w:p>
+    <w:p/>
+    <w:p/>
+    <w:p>
+      <w:r>
+        <w:t xml:space="preserve">Crie um caso de uso para as </w:t>
+      </w:r>
+      <w:r>
+        <w:t>Agenda de uma clinica</w:t>
+      </w:r>
+      <w:r>
+        <w:t xml:space="preserve"> , este caso de uso inicia-se quando um usuário do tipo </w:t>
+      </w:r>
+      <w:r>
+        <w:t xml:space="preserve">Administrador de Clinica, </w:t>
+      </w:r>
+      <w:r>
+        <w:t xml:space="preserve"> seleciona no menu a opção </w:t>
+      </w:r>
+      <w:r>
+        <w:t>Agenda</w:t>
+      </w:r>
+      <w:r>
+        <w:t xml:space="preserve"> então o sistema exibe a lista de consultas marcadas pra </w:t>
+      </w:r>
+      <w:r>
+        <w:t>a clinica</w:t>
+      </w:r>
+      <w:r>
+        <w:t xml:space="preserve">, </w:t>
+      </w:r>
+      <w:r>
+        <w:t xml:space="preserve"> </w:t>
+      </w:r>
+      <w:r>
+        <w:t xml:space="preserve">onde </w:t>
+      </w:r>
+      <w:r>
+        <w:t xml:space="preserve">O ADMC </w:t>
+      </w:r>
+      <w:r>
+        <w:t xml:space="preserve"> pode filtrar essas consultas por </w:t>
+      </w:r>
+      <w:r>
+        <w:t>Data início</w:t>
+      </w:r>
+      <w:r>
+        <w:t xml:space="preserve">, </w:t>
+      </w:r>
+      <w:r>
+        <w:t>Data final</w:t>
+      </w:r>
+      <w:r>
+        <w:t xml:space="preserve">, </w:t>
+      </w:r>
+      <w:r>
+        <w:t>Paciente</w:t>
+      </w:r>
+      <w:r>
+        <w:t xml:space="preserve">, Status valores possíveis (Todos, Sala de Espera, Aguardando atendimento, Cancelada, Em Atendimento, Finalizada) e </w:t>
+      </w:r>
+      <w:r>
+        <w:t>Especialista</w:t>
+      </w:r>
+      <w:r>
+        <w:t xml:space="preserve">, o usuário </w:t>
+      </w:r>
+      <w:r>
+        <w:t>ADMC</w:t>
+      </w:r>
+      <w:r>
+        <w:t xml:space="preserve"> pode selecionar a opção pesquisar então o sistema exibe a lista de consultas que atende ao filtro, permitindo ao especialista executar as seguintes ações: </w:t>
+      </w:r>
+      <w:r>
+        <w:t xml:space="preserve">Fazer encaminhamento, </w:t>
+      </w:r>
+      <w:r>
+        <w:t>Efetuar Pagamento</w:t>
+      </w:r>
+      <w:r>
+        <w:t xml:space="preserve">, </w:t>
+      </w:r>
+      <w:r>
+        <w:t xml:space="preserve">Cancelar Consulta. </w:t>
+      </w:r>
+    </w:p>
+    <w:p>
+      <w:r>
+        <w:lastRenderedPageBreak/>
+        <w:t xml:space="preserve">Caso o </w:t>
+      </w:r>
+      <w:r>
+        <w:t>ADMC</w:t>
+      </w:r>
+      <w:r>
+        <w:t xml:space="preserve"> solicite a opção efetuar Pagamento, O sistema então exibe as opções PIX, </w:t>
+      </w:r>
+      <w:r>
+        <w:t>Espécie</w:t>
+      </w:r>
+      <w:r>
+        <w:t xml:space="preserve"> ou Cartão, </w:t>
+      </w:r>
+      <w:proofErr w:type="gramStart"/>
+      <w:r>
+        <w:t>Caso</w:t>
+      </w:r>
+      <w:proofErr w:type="gramEnd"/>
+      <w:r>
+        <w:t xml:space="preserve"> o usuário solicite cartão o sistema então exibe as opções </w:t>
+      </w:r>
+      <w:r>
+        <w:t>Cartão</w:t>
+      </w:r>
+      <w:r>
+        <w:t xml:space="preserve"> Cadastrado ou Maquineta, caso o usuário solicite a opção maquineta o usuário é obrigado a digitar o </w:t>
+      </w:r>
+      <w:proofErr w:type="gramStart"/>
+      <w:r>
+        <w:t>numero</w:t>
+      </w:r>
+      <w:proofErr w:type="gramEnd"/>
+      <w:r>
+        <w:t xml:space="preserve"> de autorização do cartão de </w:t>
+      </w:r>
+      <w:proofErr w:type="gramStart"/>
+      <w:r>
+        <w:t>credito</w:t>
+      </w:r>
+      <w:proofErr w:type="gramEnd"/>
+      <w:r>
+        <w:t xml:space="preserve">. Caso ele selecione pix o sistema retorna </w:t>
+      </w:r>
+      <w:proofErr w:type="gramStart"/>
+      <w:r>
+        <w:t>pra</w:t>
+      </w:r>
+      <w:proofErr w:type="gramEnd"/>
+      <w:r>
+        <w:t xml:space="preserve"> lista de consultas, caso ele escolha espécie o sistema retorna </w:t>
+      </w:r>
+      <w:proofErr w:type="gramStart"/>
+      <w:r>
+        <w:t>pra</w:t>
+      </w:r>
+      <w:proofErr w:type="gramEnd"/>
+      <w:r>
+        <w:t xml:space="preserve"> lista de consultas, se ele selecionar opção Cartão cadastrado o sistema redireciona para o </w:t>
+      </w:r>
+      <w:proofErr w:type="spellStart"/>
+      <w:r>
+        <w:t>gatway</w:t>
+      </w:r>
+      <w:proofErr w:type="spellEnd"/>
+      <w:r>
+        <w:t xml:space="preserve"> de pagamento executa o processamento e retorna para a lista de consultas.</w:t>
+      </w:r>
+    </w:p>
+    <w:p>
+      <w:r>
+        <w:t xml:space="preserve">Caso o ADMC solicite a opção realizar encaminhamento o sistema exibe um formulário contendo o local onde o especialista está atendendo e o tipo do atendimento que pode ser normal e prioritário, os campos são obrigatórios, o usuário pode selecionar a opção voltar que retorna para a agenda, </w:t>
+      </w:r>
+      <w:proofErr w:type="gramStart"/>
+      <w:r>
+        <w:t>ou Encaminhar</w:t>
+      </w:r>
+      <w:proofErr w:type="gramEnd"/>
+      <w:r>
+        <w:t xml:space="preserve"> que o sistema salva as informações e retorna para a agenda mudando o status da consulta para Sala de Espera. Regra de negócio, somente </w:t>
+      </w:r>
+      <w:proofErr w:type="gramStart"/>
+      <w:r>
+        <w:t>um consulta não encaminhada</w:t>
+      </w:r>
+      <w:proofErr w:type="gramEnd"/>
+      <w:r>
+        <w:t xml:space="preserve"> pode ser encaminhada. Crie um fluxo alterar encaminhamento, onde o usuário ADMC pode alterar qual o destino do paciente e qual sua prioridade.</w:t>
+      </w:r>
+    </w:p>
+    <w:p/>
     <w:p/>
     <w:p/>
     <w:p/>

</xml_diff>

<commit_message>
Subindo caso de uso Configurações
Subindo caso de uso Configurações
</commit_message>
<xml_diff>
--- a/documentação/Requisitos/RequisitoIncluaNovoUsuario.docx
+++ b/documentação/Requisitos/RequisitoIncluaNovoUsuario.docx
@@ -286,10 +286,12 @@
       <w:r>
         <w:t xml:space="preserve"> de </w:t>
       </w:r>
+      <w:proofErr w:type="spellStart"/>
       <w:proofErr w:type="gramStart"/>
       <w:r>
         <w:t>boas vindas</w:t>
       </w:r>
+      <w:proofErr w:type="spellEnd"/>
       <w:proofErr w:type="gramEnd"/>
       <w:r>
         <w:t xml:space="preserve"> para o usuário</w:t>
@@ -359,10 +361,12 @@
       <w:r>
         <w:t xml:space="preserve"> de </w:t>
       </w:r>
+      <w:proofErr w:type="spellStart"/>
       <w:proofErr w:type="gramStart"/>
       <w:r>
         <w:t>boas vindas</w:t>
       </w:r>
+      <w:proofErr w:type="spellEnd"/>
       <w:proofErr w:type="gramEnd"/>
       <w:r>
         <w:t xml:space="preserve"> para o usuário</w:t>
@@ -2151,10 +2155,12 @@
       <w:r>
         <w:t xml:space="preserve">Regra de </w:t>
       </w:r>
+      <w:proofErr w:type="spellStart"/>
       <w:proofErr w:type="gramStart"/>
       <w:r>
         <w:t>negocio</w:t>
       </w:r>
+      <w:proofErr w:type="spellEnd"/>
       <w:proofErr w:type="gramEnd"/>
       <w:r>
         <w:t xml:space="preserve"> 01, </w:t>
@@ -2416,7 +2422,15 @@
       </w:r>
       <w:proofErr w:type="spellEnd"/>
       <w:r>
-        <w:t xml:space="preserve">, exames, onde o especialista poderá solicitar uma lista de exames a ser realizados, Prontuário Completo, onde contém todo o histórico de consultas anteriores como o exemplo </w:t>
+        <w:t xml:space="preserve">, exames, onde o especialista poderá solicitar uma lista de exames a </w:t>
+      </w:r>
+      <w:proofErr w:type="gramStart"/>
+      <w:r>
+        <w:t>ser</w:t>
+      </w:r>
+      <w:proofErr w:type="gramEnd"/>
+      <w:r>
+        <w:t xml:space="preserve"> realizados, Prontuário Completo, onde contém todo o histórico de consultas anteriores como o exemplo </w:t>
       </w:r>
       <w:proofErr w:type="gramStart"/>
       <w:r>
@@ -2467,33 +2481,7 @@
           <w:lang w:eastAsia="pt-BR"/>
           <w14:ligatures w14:val="none"/>
         </w:rPr>
-        <w:t xml:space="preserve">Especialista: Raiane </w:t>
-      </w:r>
-      <w:proofErr w:type="spellStart"/>
-      <w:r>
-        <w:rPr>
-          <w:rFonts w:ascii="Poppins" w:eastAsia="Times New Roman" w:hAnsi="Poppins" w:cs="Poppins"/>
-          <w:color w:val="525F7F"/>
-          <w:kern w:val="0"/>
-          <w:sz w:val="21"/>
-          <w:szCs w:val="21"/>
-          <w:lang w:eastAsia="pt-BR"/>
-          <w14:ligatures w14:val="none"/>
-        </w:rPr>
-        <w:t>Darla</w:t>
-      </w:r>
-      <w:proofErr w:type="spellEnd"/>
-      <w:r>
-        <w:rPr>
-          <w:rFonts w:ascii="Poppins" w:eastAsia="Times New Roman" w:hAnsi="Poppins" w:cs="Poppins"/>
-          <w:color w:val="525F7F"/>
-          <w:kern w:val="0"/>
-          <w:sz w:val="21"/>
-          <w:szCs w:val="21"/>
-          <w:lang w:eastAsia="pt-BR"/>
-          <w14:ligatures w14:val="none"/>
-        </w:rPr>
-        <w:t xml:space="preserve"> Moreira Dias Vieira - Psicopedagogia</w:t>
+        <w:t>Especialista: Raiane Darla Moreira Dias Vieira - Psicopedagogia</w:t>
       </w:r>
     </w:p>
     <w:p>
@@ -2874,103 +2862,31 @@
     <w:p/>
     <w:p>
       <w:r>
-        <w:t xml:space="preserve">Crie um caso de uso para as </w:t>
-      </w:r>
-      <w:r>
-        <w:t>Agenda de uma clinica</w:t>
-      </w:r>
-      <w:r>
-        <w:t xml:space="preserve"> , este caso de uso inicia-se quando um usuário do tipo </w:t>
-      </w:r>
-      <w:r>
-        <w:t xml:space="preserve">Administrador de Clinica, </w:t>
-      </w:r>
-      <w:r>
-        <w:t xml:space="preserve"> seleciona no menu a opção </w:t>
-      </w:r>
-      <w:r>
-        <w:t>Agenda</w:t>
-      </w:r>
-      <w:r>
-        <w:t xml:space="preserve"> então o sistema exibe a lista de consultas marcadas pra </w:t>
-      </w:r>
-      <w:r>
-        <w:t>a clinica</w:t>
+        <w:t xml:space="preserve">Crie um caso de uso para as Agenda de uma clinica , este caso de uso inicia-se quando um usuário do tipo Administrador de Clinica,  seleciona no menu a opção Agenda então o sistema exibe a lista de consultas marcadas pra a clinica,  onde O ADMC  pode filtrar essas consultas por </w:t>
+      </w:r>
+      <w:r>
+        <w:t>Data início</w:t>
       </w:r>
       <w:r>
         <w:t xml:space="preserve">, </w:t>
       </w:r>
       <w:r>
-        <w:t xml:space="preserve"> </w:t>
-      </w:r>
-      <w:r>
-        <w:t xml:space="preserve">onde </w:t>
-      </w:r>
-      <w:r>
-        <w:t xml:space="preserve">O ADMC </w:t>
-      </w:r>
-      <w:r>
-        <w:t xml:space="preserve"> pode filtrar essas consultas por </w:t>
-      </w:r>
-      <w:r>
-        <w:t>Data início</w:t>
+        <w:t>Data final</w:t>
       </w:r>
       <w:r>
         <w:t xml:space="preserve">, </w:t>
       </w:r>
       <w:r>
-        <w:t>Data final</w:t>
-      </w:r>
-      <w:r>
-        <w:t xml:space="preserve">, </w:t>
-      </w:r>
-      <w:r>
         <w:t>Paciente</w:t>
       </w:r>
       <w:r>
-        <w:t xml:space="preserve">, Status valores possíveis (Todos, Sala de Espera, Aguardando atendimento, Cancelada, Em Atendimento, Finalizada) e </w:t>
-      </w:r>
-      <w:r>
-        <w:t>Especialista</w:t>
-      </w:r>
-      <w:r>
-        <w:t xml:space="preserve">, o usuário </w:t>
-      </w:r>
-      <w:r>
-        <w:t>ADMC</w:t>
-      </w:r>
-      <w:r>
-        <w:t xml:space="preserve"> pode selecionar a opção pesquisar então o sistema exibe a lista de consultas que atende ao filtro, permitindo ao especialista executar as seguintes ações: </w:t>
-      </w:r>
-      <w:r>
-        <w:t xml:space="preserve">Fazer encaminhamento, </w:t>
-      </w:r>
-      <w:r>
-        <w:t>Efetuar Pagamento</w:t>
-      </w:r>
-      <w:r>
-        <w:t xml:space="preserve">, </w:t>
-      </w:r>
-      <w:r>
-        <w:t xml:space="preserve">Cancelar Consulta. </w:t>
+        <w:t xml:space="preserve">, Status valores possíveis (Todos, Sala de Espera, Aguardando atendimento, Cancelada, Em Atendimento, Finalizada) e Especialista, o usuário ADMC pode selecionar a opção pesquisar então o sistema exibe a lista de consultas que atende ao filtro, permitindo ao especialista executar as seguintes ações: Fazer encaminhamento, Efetuar Pagamento, Cancelar Consulta. </w:t>
       </w:r>
     </w:p>
     <w:p>
       <w:r>
         <w:lastRenderedPageBreak/>
-        <w:t xml:space="preserve">Caso o </w:t>
-      </w:r>
-      <w:r>
-        <w:t>ADMC</w:t>
-      </w:r>
-      <w:r>
-        <w:t xml:space="preserve"> solicite a opção efetuar Pagamento, O sistema então exibe as opções PIX, </w:t>
-      </w:r>
-      <w:r>
-        <w:t>Espécie</w:t>
-      </w:r>
-      <w:r>
-        <w:t xml:space="preserve"> ou Cartão, </w:t>
+        <w:t xml:space="preserve">Caso o ADMC solicite a opção efetuar Pagamento, O sistema então exibe as opções PIX, Espécie ou Cartão, </w:t>
       </w:r>
       <w:proofErr w:type="gramStart"/>
       <w:r>
@@ -2978,13 +2894,7 @@
       </w:r>
       <w:proofErr w:type="gramEnd"/>
       <w:r>
-        <w:t xml:space="preserve"> o usuário solicite cartão o sistema então exibe as opções </w:t>
-      </w:r>
-      <w:r>
-        <w:t>Cartão</w:t>
-      </w:r>
-      <w:r>
-        <w:t xml:space="preserve"> Cadastrado ou Maquineta, caso o usuário solicite a opção maquineta o usuário é obrigado a digitar o </w:t>
+        <w:t xml:space="preserve"> o usuário solicite cartão o sistema então exibe as opções Cartão Cadastrado ou Maquineta, caso o usuário solicite a opção maquineta o usuário é obrigado a digitar o </w:t>
       </w:r>
       <w:proofErr w:type="gramStart"/>
       <w:r>
@@ -3046,6 +2956,106 @@
       <w:proofErr w:type="gramEnd"/>
       <w:r>
         <w:t xml:space="preserve"> pode ser encaminhada. Crie um fluxo alterar encaminhamento, onde o usuário ADMC pode alterar qual o destino do paciente e qual sua prioridade.</w:t>
+      </w:r>
+    </w:p>
+    <w:p/>
+    <w:p>
+      <w:r>
+        <w:t xml:space="preserve">Crie um caso de uso para a disponibilização de consultas , este caso de uso inicia-se quando um usuário do tipo especialista seleciona no menu a opção disponibilizar consultas,  o sistema então exibe um formulário com os campos Clinica Vinculada, Data de </w:t>
+      </w:r>
+      <w:proofErr w:type="spellStart"/>
+      <w:r>
+        <w:t>Inicio</w:t>
+      </w:r>
+      <w:proofErr w:type="spellEnd"/>
+      <w:r>
+        <w:t xml:space="preserve">, Data fim, duração média em minutos, intervalo de consultas em minutos, Horário do Início dos atendimentos, Horário do Fim dos atendimentos, Preço em R$, e os dias da semana de segunda a domingo </w:t>
+      </w:r>
+      <w:proofErr w:type="spellStart"/>
+      <w:r>
+        <w:t>multipa</w:t>
+      </w:r>
+      <w:proofErr w:type="spellEnd"/>
+      <w:r>
+        <w:t xml:space="preserve"> escolha, o usuário então preenche os campos e solicita a opção Salvar, o sistema então irá gerar consultas no período solicitado nos dias solicitados com duração solicitada e com intervalo entre as consultas configurada, a opôs a geração o sistema irá pra o UC AGENDA. </w:t>
+      </w:r>
+    </w:p>
+    <w:p/>
+    <w:p/>
+    <w:p>
+      <w:r>
+        <w:t xml:space="preserve">Crie um caso de uso para as configurações das especialidades da </w:t>
+      </w:r>
+      <w:proofErr w:type="spellStart"/>
+      <w:proofErr w:type="gramStart"/>
+      <w:r>
+        <w:t>clinica</w:t>
+      </w:r>
+      <w:proofErr w:type="spellEnd"/>
+      <w:proofErr w:type="gramEnd"/>
+      <w:r>
+        <w:t xml:space="preserve">, este caso de uso inicia-se quando um usuário, do tipo </w:t>
+      </w:r>
+      <w:proofErr w:type="spellStart"/>
+      <w:proofErr w:type="gramStart"/>
+      <w:r>
+        <w:t>clinica</w:t>
+      </w:r>
+      <w:proofErr w:type="spellEnd"/>
+      <w:proofErr w:type="gramEnd"/>
+      <w:r>
+        <w:t xml:space="preserve">, seleciona no menu a opção configurações, o sistema então exibe no menu de opções abaixo as especialidades, ao clicar em especialidades, o sistema exibe a lista de especialidades </w:t>
+      </w:r>
+      <w:proofErr w:type="gramStart"/>
+      <w:r>
+        <w:t>clinicas</w:t>
+      </w:r>
+      <w:proofErr w:type="gramEnd"/>
+      <w:r>
+        <w:t xml:space="preserve">, no qual, existe a especialidade, o valor, editar, o tipo de </w:t>
+      </w:r>
+      <w:proofErr w:type="gramStart"/>
+      <w:r>
+        <w:t>vinculo</w:t>
+      </w:r>
+      <w:proofErr w:type="gramEnd"/>
+      <w:r>
+        <w:t xml:space="preserve">. Sendo possível a exclusão da </w:t>
+      </w:r>
+      <w:proofErr w:type="gramStart"/>
+      <w:r>
+        <w:t>especialidade,  e</w:t>
+      </w:r>
+      <w:proofErr w:type="gramEnd"/>
+      <w:r>
+        <w:t xml:space="preserve"> a adição de novas especialidades no ícone no canto direito da tela. Ao clicar em adicionar, é exibida uma tela com as opções de edição de especialidade e valor, podendo salvar ou </w:t>
+      </w:r>
+      <w:r>
+        <w:lastRenderedPageBreak/>
+        <w:t xml:space="preserve">retornar para a tela anterior. Ao salvar, o sistema retorna para a tela anterior, e exibe uma mensagem confirmando que a operação foi realizada com sucesso. </w:t>
+      </w:r>
+      <w:r>
+        <w:t>o caso de uso deve estar organizado na ordem</w:t>
+      </w:r>
+    </w:p>
+    <w:p>
+      <w:r>
+        <w:t>1. nome do caso de uso. 2. atores envolvidos. 3. pré-condições 4. fluxo principal. 5. fluxos</w:t>
+      </w:r>
+    </w:p>
+    <w:p>
+      <w:r>
+        <w:t xml:space="preserve">alternativos 6. pós-condições 7. regras de </w:t>
+      </w:r>
+      <w:proofErr w:type="spellStart"/>
+      <w:proofErr w:type="gramStart"/>
+      <w:r>
+        <w:t>negocio</w:t>
+      </w:r>
+      <w:proofErr w:type="spellEnd"/>
+      <w:proofErr w:type="gramEnd"/>
+      <w:r>
+        <w:t>.</w:t>
       </w:r>
     </w:p>
     <w:p/>

</xml_diff>